<commit_message>
Sua lai cau tra loi
</commit_message>
<xml_diff>
--- a/Slot_2/AnswerLAB_1.docx
+++ b/Slot_2/AnswerLAB_1.docx
@@ -8,8 +8,6 @@
           <w:rFonts w:hint="default" w:ascii="Times New Roman" w:hAnsi="Times New Roman" w:cs="Times New Roman"/>
         </w:rPr>
       </w:pPr>
-      <w:bookmarkStart w:id="83" w:name="_GoBack"/>
-      <w:bookmarkEnd w:id="83"/>
     </w:p>
     <w:sdt>
       <w:sdtPr>
@@ -191,13 +189,7 @@
             <w:rPr>
               <w:rFonts w:hint="default" w:ascii="Times New Roman" w:hAnsi="Times New Roman" w:cs="Times New Roman"/>
             </w:rPr>
-            <w:t xml:space="preserve">1.1. </w:t>
-          </w:r>
-          <w:r>
-            <w:rPr>
-              <w:rFonts w:hint="default" w:ascii="Times New Roman" w:hAnsi="Times New Roman" w:cs="Times New Roman"/>
-            </w:rPr>
-            <w:t>Prompt:</w:t>
+            <w:t>1.1. Prompt:</w:t>
           </w:r>
           <w:r>
             <w:rPr>
@@ -1008,13 +1000,7 @@
             <w:rPr>
               <w:rFonts w:hint="default" w:ascii="Times New Roman" w:hAnsi="Times New Roman" w:cs="Times New Roman"/>
             </w:rPr>
-            <w:t xml:space="preserve">2.1. </w:t>
-          </w:r>
-          <w:r>
-            <w:rPr>
-              <w:rFonts w:hint="default" w:ascii="Times New Roman" w:hAnsi="Times New Roman" w:cs="Times New Roman"/>
-            </w:rPr>
-            <w:t>Prompt:</w:t>
+            <w:t>2.1. Prompt:</w:t>
           </w:r>
           <w:r>
             <w:rPr>
@@ -7785,29 +7771,6 @@
     </w:p>
     <w:p>
       <w:pPr>
-        <w:pStyle w:val="12"/>
-        <w:bidi w:val="0"/>
-        <w:rPr>
-          <w:rFonts w:hint="default" w:ascii="Times New Roman" w:hAnsi="Times New Roman" w:cs="Times New Roman"/>
-          <w:lang w:val="en-US"/>
-        </w:rPr>
-      </w:pPr>
-      <w:r>
-        <w:rPr>
-          <w:rFonts w:hint="default" w:ascii="Times New Roman" w:hAnsi="Times New Roman" w:cs="Times New Roman"/>
-          <w:lang w:val="en-US"/>
-        </w:rPr>
-        <w:t>“T</w:t>
-      </w:r>
-      <w:r>
-        <w:rPr>
-          <w:rFonts w:hint="default" w:ascii="Times New Roman" w:hAnsi="Times New Roman" w:cs="Times New Roman"/>
-        </w:rPr>
-        <w:t>ôi đang là sinh viện học về môn software testing và tôi đang đọc tài liệu có tên là "Fundations_of_Software_Testing_ISTQB" và tôi đang muốn giải câu hỏi sau: "What is testing?" và kiến thức tôi cần nắm rõ là" Định nghĩa testing; mục tiêu (test objectives); testing vs debugging; verification vs validation."</w:t>
-      </w:r>
-    </w:p>
-    <w:p>
-      <w:pPr>
         <w:pStyle w:val="15"/>
         <w:numPr>
           <w:ilvl w:val="2"/>
@@ -7819,6 +7782,8 @@
           <w:lang w:val="en-US"/>
         </w:rPr>
       </w:pPr>
+      <w:bookmarkStart w:id="83" w:name="_GoBack"/>
+      <w:bookmarkEnd w:id="83"/>
       <w:bookmarkStart w:id="13" w:name="_Toc14242"/>
       <w:r>
         <w:rPr>
@@ -9352,13 +9317,7 @@
         <w:rPr>
           <w:rFonts w:hint="default" w:ascii="Times New Roman" w:hAnsi="Times New Roman" w:cs="Times New Roman"/>
         </w:rPr>
-        <w:t xml:space="preserve">  </w:t>
-      </w:r>
-      <w:r>
-        <w:rPr>
-          <w:rFonts w:hint="default" w:ascii="Times New Roman" w:hAnsi="Times New Roman" w:cs="Times New Roman"/>
-        </w:rPr>
-        <w:t>Hoạt động này liên tục diễn ra song song để so sánh tiến độ thực tế với kế hoạch đã định, từ đó đưa ra các hành động điều chỉnh kịp thời nếu có sai lệch.</w:t>
+        <w:t xml:space="preserve">  Hoạt động này liên tục diễn ra song song để so sánh tiến độ thực tế với kế hoạch đã định, từ đó đưa ra các hành động điều chỉnh kịp thời nếu có sai lệch.</w:t>
       </w:r>
     </w:p>
     <w:p>
@@ -9455,13 +9414,7 @@
         <w:rPr>
           <w:rFonts w:hint="default" w:ascii="Times New Roman" w:hAnsi="Times New Roman" w:cs="Times New Roman"/>
         </w:rPr>
-        <w:t xml:space="preserve"> </w:t>
-      </w:r>
-      <w:r>
-        <w:rPr>
-          <w:rFonts w:hint="default" w:ascii="Times New Roman" w:hAnsi="Times New Roman" w:cs="Times New Roman"/>
-        </w:rPr>
-        <w:t>Đầu ra: Danh sách các điều kiện kiểm thử (Test Conditions) và các báo cáo lỗi về tài liệu (nếu tài liệu có sự chênh lệch/mơ hồ).</w:t>
+        <w:t xml:space="preserve"> Đầu ra: Danh sách các điều kiện kiểm thử (Test Conditions) và các báo cáo lỗi về tài liệu (nếu tài liệu có sự chênh lệch/mơ hồ).</w:t>
       </w:r>
     </w:p>
     <w:p>
@@ -10231,6 +10184,12 @@
           <w:lang w:val="en-US"/>
         </w:rPr>
         <w:tab/>
+      </w:r>
+      <w:r>
+        <w:rPr>
+          <w:rFonts w:hint="default" w:ascii="Times New Roman" w:hAnsi="Times New Roman" w:cs="Times New Roman"/>
+          <w:lang w:val="en-US"/>
+        </w:rPr>
         <w:t xml:space="preserve">- </w:t>
       </w:r>
       <w:r>
@@ -11093,6 +11052,7 @@
       <w:pPr>
         <w:pStyle w:val="13"/>
         <w:numPr>
+          <w:ilvl w:val="0"/>
           <w:numId w:val="0"/>
         </w:numPr>
         <w:bidi w:val="0"/>
@@ -11388,7 +11348,7 @@
     <w:lsdException w:unhideWhenUsed="0" w:uiPriority="0" w:semiHidden="0" w:name="Body Text Indent 2"/>
     <w:lsdException w:unhideWhenUsed="0" w:uiPriority="0" w:semiHidden="0" w:name="Body Text Indent 3"/>
     <w:lsdException w:unhideWhenUsed="0" w:uiPriority="0" w:semiHidden="0" w:name="Block Text"/>
-    <w:lsdException w:unhideWhenUsed="0" w:uiPriority="0" w:semiHidden="0" w:name="Hyperlink"/>
+    <w:lsdException w:qFormat="1" w:unhideWhenUsed="0" w:uiPriority="0" w:semiHidden="0" w:name="Hyperlink"/>
     <w:lsdException w:unhideWhenUsed="0" w:uiPriority="0" w:semiHidden="0" w:name="FollowedHyperlink"/>
     <w:lsdException w:qFormat="1" w:unhideWhenUsed="0" w:uiPriority="0" w:semiHidden="0" w:name="Strong"/>
     <w:lsdException w:qFormat="1" w:unhideWhenUsed="0" w:uiPriority="0" w:semiHidden="0" w:name="Emphasis"/>
@@ -11666,6 +11626,7 @@
   <w:style w:type="character" w:styleId="8">
     <w:name w:val="Hyperlink"/>
     <w:basedOn w:val="6"/>
+    <w:qFormat/>
     <w:uiPriority w:val="0"/>
     <w:rPr>
       <w:color w:val="0000FF"/>
@@ -11803,28 +11764,33 @@
       <w:ind w:leftChars="0"/>
     </w:pPr>
     <w:rPr>
+      <w:rFonts w:ascii="Times New Roman" w:hAnsi="Times New Roman" w:eastAsia="SimSun" w:cs="Times New Roman"/>
       <w:sz w:val="20"/>
       <w:szCs w:val="20"/>
     </w:rPr>
   </w:style>
   <w:style w:type="paragraph" w:customStyle="1" w:styleId="20">
     <w:name w:val="WPSOffice手动目录 2"/>
+    <w:qFormat/>
     <w:uiPriority w:val="0"/>
     <w:pPr>
       <w:ind w:leftChars="200"/>
     </w:pPr>
     <w:rPr>
+      <w:rFonts w:ascii="Times New Roman" w:hAnsi="Times New Roman" w:eastAsia="SimSun" w:cs="Times New Roman"/>
       <w:sz w:val="20"/>
       <w:szCs w:val="20"/>
     </w:rPr>
   </w:style>
   <w:style w:type="paragraph" w:customStyle="1" w:styleId="21">
     <w:name w:val="WPSOffice手动目录 3"/>
+    <w:qFormat/>
     <w:uiPriority w:val="0"/>
     <w:pPr>
       <w:ind w:leftChars="400"/>
     </w:pPr>
     <w:rPr>
+      <w:rFonts w:ascii="Times New Roman" w:hAnsi="Times New Roman" w:eastAsia="SimSun" w:cs="Times New Roman"/>
       <w:sz w:val="20"/>
       <w:szCs w:val="20"/>
     </w:rPr>

</xml_diff>